<commit_message>
Docs: save requirements document cleanup for v0.2.0
</commit_message>
<xml_diff>
--- a/EyalEspressoRequirements and Design.docx
+++ b/EyalEspressoRequirements and Design.docx
@@ -2,14 +2,14 @@
 <file path=docProps\app.xml><?xml version="1.0" encoding="utf-8"?>
 <Properties xmlns="http://schemas.openxmlformats.org/officeDocument/2006/extended-properties" xmlns:vt="http://schemas.openxmlformats.org/officeDocument/2006/docPropsVTypes">
   <Template>Normal.dotm</Template>
-  <TotalTime>124</TotalTime>
-  <Pages>5</Pages>
-  <Words>876</Words>
-  <Characters>5429</Characters>
+  <TotalTime>127</TotalTime>
+  <Pages>1</Pages>
+  <Words>971</Words>
+  <Characters>5722</Characters>
   <Application>Microsoft Office Word</Application>
   <DocSecurity>0</DocSecurity>
-  <Lines>120</Lines>
-  <Paragraphs>81</Paragraphs>
+  <Lines>130</Lines>
+  <Paragraphs>77</Paragraphs>
   <ScaleCrop>false</ScaleCrop>
   <HeadingPairs>
     <vt:vector size="2" baseType="variant">
@@ -28,7 +28,7 @@
   </TitlesOfParts>
   <Company/>
   <LinksUpToDate>false</LinksUpToDate>
-  <CharactersWithSpaces>6224</CharactersWithSpaces>
+  <CharactersWithSpaces>6616</CharactersWithSpaces>
   <SharedDoc>false</SharedDoc>
   <HyperlinksChanged>false</HyperlinksChanged>
   <AppVersion>16.0000</AppVersion>
@@ -38,9 +38,9 @@
 <file path=docProps\core.xml><?xml version="1.0" encoding="utf-8"?>
 <cp:coreProperties xmlns:cp="http://schemas.openxmlformats.org/package/2006/metadata/core-properties" xmlns:dc="http://purl.org/dc/elements/1.1/" xmlns:dcterms="http://purl.org/dc/terms/" xmlns:dcmitype="http://purl.org/dc/dcmitype/" xmlns:xsi="http://www.w3.org/2001/XMLSchema-instance">
   <cp:lastModifiedBy>Eyal Glotman @CRnR</cp:lastModifiedBy>
-  <cp:revision>14</cp:revision>
+  <cp:revision>16</cp:revision>
   <dcterms:created xsi:type="dcterms:W3CDTF">2026-03-07T14:11:00Z</dcterms:created>
-  <dcterms:modified xsi:type="dcterms:W3CDTF">2026-03-07T16:15:00Z</dcterms:modified>
+  <dcterms:modified xsi:type="dcterms:W3CDTF">2026-03-07T17:55:00Z</dcterms:modified>
 </cp:coreProperties>
 </file>
 
@@ -77,7 +77,21 @@
         <w:rPr>
           <w:lang w:val="en-US"/>
         </w:rPr>
-        <w:t>Reviewed on: 7-Mar-26 18:11</w:t>
+        <w:t xml:space="preserve">Reviewed </w:t>
+      </w:r>
+      <w:proofErr w:type="gramStart"/>
+      <w:r>
+        <w:rPr>
+          <w:lang w:val="en-US"/>
+        </w:rPr>
+        <w:t>on:</w:t>
+      </w:r>
+      <w:proofErr w:type="gramEnd"/>
+      <w:r>
+        <w:rPr>
+          <w:lang w:val="en-US"/>
+        </w:rPr>
+        <w:t xml:space="preserve"> 07-Mar-26 19:56:44</w:t>
       </w:r>
     </w:p>
     <w:p>
@@ -193,23 +207,23 @@
         <w:rPr>
           <w:lang w:val="en-US"/>
         </w:rPr>
-        <w:t>The â€œInitializationâ€ state shall have a splash screen with textual information about the progress</w:t>
-      </w:r>
-    </w:p>
-    <w:p>
-      <w:pPr>
-        <w:pStyle w:val="ListParagraph"/>
-        <w:numPr>
-          <w:ilvl w:val="0"/>
-          <w:numId w:val="1"/>
-        </w:numPr>
-        <w:ind w:left="1134" w:hanging="1134"/>
-      </w:pPr>
-      <w:r>
-        <w:rPr>
-          <w:lang w:val="en-US"/>
-        </w:rPr>
-        <w:t>The â€œUseâ€ state shall be UI related and allow the user to select and operate the system</w:t>
+        <w:t>The "Initialization" state shall have a splash screen with textual information about the progress</w:t>
+      </w:r>
+    </w:p>
+    <w:p>
+      <w:pPr>
+        <w:pStyle w:val="ListParagraph"/>
+        <w:numPr>
+          <w:ilvl w:val="0"/>
+          <w:numId w:val="1"/>
+        </w:numPr>
+        <w:ind w:left="1134" w:hanging="1134"/>
+      </w:pPr>
+      <w:r>
+        <w:rPr>
+          <w:lang w:val="en-US"/>
+        </w:rPr>
+        <w:t>The "Use" state shall be UI related and allow the user to select and operate the system</w:t>
       </w:r>
     </w:p>
     <w:p>
@@ -226,7 +240,7 @@
           <w:lang w:val="en-US"/>
         </w:rPr>
         <w:lastRenderedPageBreak/>
-        <w:t xml:space="preserve">The â€œErrorâ€ shall have a UI with the persistent errors displayed and a single button â€œResetâ€, leading to initialization state where the system would perform a BIT to test for status. </w:t>
+        <w:t xml:space="preserve">The "Error" shall have a UI with the persistent errors displayed and a single button "Reset", leading to initialization state where the system would perform a BIT to test for status. </w:t>
       </w:r>
     </w:p>
     <w:p>
@@ -481,22 +495,23 @@
         <w:rPr>
           <w:lang w:val="en-US"/>
         </w:rPr>
-        <w:t>There shall be a database XML file on the system which contains the constants used by the system. This database shall be named: SystemConstants.xml and a default file stored in the project. This database will be referred to as â€œconstantsâ€ in this document.</w:t>
-      </w:r>
-    </w:p>
-    <w:p>
-      <w:pPr>
-        <w:pStyle w:val="ListParagraph"/>
-        <w:numPr>
-          <w:ilvl w:val="0"/>
-          <w:numId w:val="1"/>
-        </w:numPr>
-        <w:ind w:left="1134" w:hanging="1134"/>
-      </w:pPr>
-      <w:r>
-        <w:rPr>
-          <w:lang w:val="en-US"/>
-        </w:rPr>
+        <w:t>There shall be a database XML file on the system which contains the constants used by the system. This database shall be named: SystemConstants.xml and a default file stored in the project. This database will be referred to as "constants" in this document.</w:t>
+      </w:r>
+    </w:p>
+    <w:p>
+      <w:pPr>
+        <w:pStyle w:val="ListParagraph"/>
+        <w:numPr>
+          <w:ilvl w:val="0"/>
+          <w:numId w:val="1"/>
+        </w:numPr>
+        <w:ind w:left="1134" w:hanging="1134"/>
+      </w:pPr>
+      <w:r>
+        <w:rPr>
+          <w:lang w:val="en-US"/>
+        </w:rPr>
+        <w:lastRenderedPageBreak/>
         <w:t>The system shall read and load constants from the constants DB during initialization (Implemented: No)</w:t>
       </w:r>
     </w:p>
@@ -545,7 +560,6 @@
     </w:p>
     <w:p>
       <w:r>
-        <w:lastRenderedPageBreak/>
         <w:t>Performance: Screen transitions and control updates shall feel immediate on the ESP32-S3 target. (Implemented: Yes)</w:t>
       </w:r>
     </w:p>
@@ -907,7 +921,7 @@
 <file path=word\settings.xml><?xml version="1.0" encoding="utf-8"?>
 <w:settings xmlns:mc="http://schemas.openxmlformats.org/markup-compatibility/2006" xmlns:o="urn:schemas-microsoft-com:office:office" xmlns:r="http://schemas.openxmlformats.org/officeDocument/2006/relationships" xmlns:m="http://schemas.openxmlformats.org/officeDocument/2006/math" xmlns:v="urn:schemas-microsoft-com:vml" xmlns:w10="urn:schemas-microsoft-com:office:word" xmlns:w="http://schemas.openxmlformats.org/wordprocessingml/2006/main" xmlns:w14="http://schemas.microsoft.com/office/word/2010/wordml" xmlns:w15="http://schemas.microsoft.com/office/word/2012/wordml" xmlns:w16cex="http://schemas.microsoft.com/office/word/2018/wordml/cex" xmlns:w16cid="http://schemas.microsoft.com/office/word/2016/wordml/cid" xmlns:w16="http://schemas.microsoft.com/office/word/2018/wordml" xmlns:w16du="http://schemas.microsoft.com/office/word/2023/wordml/word16du" xmlns:w16sdtdh="http://schemas.microsoft.com/office/word/2020/wordml/sdtdatahash" xmlns:w16sdtfl="http://schemas.microsoft.com/office/word/2024/wordml/sdtformatlock" xmlns:w16se="http://schemas.microsoft.com/office/word/2015/wordml/symex" xmlns:sl="http://schemas.openxmlformats.org/schemaLibrary/2006/main" mc:Ignorable="w14 w15 w16se w16cid w16 w16cex w16sdtdh w16sdtfl w16du">
   <w:zoom w:percent="100"/>
-  <w:proofState w:spelling="clean"/>
+  <w:proofState w:spelling="clean" w:grammar="clean"/>
   <w:defaultTabStop w:val="720"/>
   <w:characterSpacingControl w:val="doNotCompress"/>
   <w:compat>
@@ -922,8 +936,10 @@
     <w:rsid w:val="00172730"/>
     <w:rsid w:val="001F4DEF"/>
     <w:rsid w:val="00236E38"/>
+    <w:rsid w:val="00275A25"/>
     <w:rsid w:val="002B1BCE"/>
     <w:rsid w:val="00330EB9"/>
+    <w:rsid w:val="004558CB"/>
     <w:rsid w:val="00495539"/>
     <w:rsid w:val="004F34EE"/>
     <w:rsid w:val="0050552C"/>
@@ -1721,5 +1737,8 @@
 </file>
 
 <file path=word\webSettings.xml><?xml version="1.0" encoding="utf-8"?>
-<w:webSettings xmlns:mc="http://schemas.openxmlformats.org/markup-compatibility/2006" xmlns:r="http://schemas.openxmlformats.org/officeDocument/2006/relationships" xmlns:w="http://schemas.openxmlformats.org/wordprocessingml/2006/main" xmlns:w14="http://schemas.microsoft.com/office/word/2010/wordml" xmlns:w15="http://schemas.microsoft.com/office/word/2012/wordml" xmlns:w16cex="http://schemas.microsoft.com/office/word/2018/wordml/cex" xmlns:w16cid="http://schemas.microsoft.com/office/word/2016/wordml/cid" xmlns:w16="http://schemas.microsoft.com/office/word/2018/wordml" xmlns:w16du="http://schemas.microsoft.com/office/word/2023/wordml/word16du" xmlns:w16sdtdh="http://schemas.microsoft.com/office/word/2020/wordml/sdtdatahash" xmlns:w16sdtfl="http://schemas.microsoft.com/office/word/2024/wordml/sdtformatlock" xmlns:w16se="http://schemas.microsoft.com/office/word/2015/wordml/symex" mc:Ignorable="w14 w15 w16se w16cid w16 w16cex w16sdtdh w16sdtfl w16du"/>
+<w:webSettings xmlns:mc="http://schemas.openxmlformats.org/markup-compatibility/2006" xmlns:r="http://schemas.openxmlformats.org/officeDocument/2006/relationships" xmlns:w="http://schemas.openxmlformats.org/wordprocessingml/2006/main" xmlns:w14="http://schemas.microsoft.com/office/word/2010/wordml" xmlns:w15="http://schemas.microsoft.com/office/word/2012/wordml" xmlns:w16cex="http://schemas.microsoft.com/office/word/2018/wordml/cex" xmlns:w16cid="http://schemas.microsoft.com/office/word/2016/wordml/cid" xmlns:w16="http://schemas.microsoft.com/office/word/2018/wordml" xmlns:w16du="http://schemas.microsoft.com/office/word/2023/wordml/word16du" xmlns:w16sdtdh="http://schemas.microsoft.com/office/word/2020/wordml/sdtdatahash" xmlns:w16sdtfl="http://schemas.microsoft.com/office/word/2024/wordml/sdtformatlock" xmlns:w16se="http://schemas.microsoft.com/office/word/2015/wordml/symex" mc:Ignorable="w14 w15 w16se w16cid w16 w16cex w16sdtdh w16sdtfl w16du">
+  <w:relyOnVML/>
+  <w:allowPNG/>
+</w:webSettings>
 </file>
</xml_diff>

<commit_message>
Release v0.2.1 - move UI into tabs
</commit_message>
<xml_diff>
--- a/EyalEspressoRequirements and Design.docx
+++ b/EyalEspressoRequirements and Design.docx
@@ -59,7 +59,7 @@
     </w:p>
     <w:p>
       <w:r>
-        <w:t>Version: 0.2.0</w:t>
+        <w:t>Version: 0.2.1</w:t>
       </w:r>
     </w:p>
     <w:p>
@@ -91,7 +91,7 @@
         <w:rPr>
           <w:lang w:val="en-US"/>
         </w:rPr>
-        <w:t xml:space="preserve"> 07-Mar-26 19:56:44</w:t>
+        <w:t xml:space="preserve"> 07-Mar-26 20:42:55</w:t>
       </w:r>
     </w:p>
     <w:p>
@@ -637,20 +637,20 @@
         <w:rPr>
           <w:lang w:val="en-US"/>
         </w:rPr>
-        <w:t xml:space="preserve"> of the screen</w:t>
-      </w:r>
-    </w:p>
-    <w:p>
-      <w:pPr>
-        <w:rPr>
-          <w:lang w:val="en-US"/>
-        </w:rPr>
-      </w:pPr>
-      <w:r>
-        <w:rPr>
-          <w:lang w:val="en-US"/>
-        </w:rPr>
-        <w:t>Both press and toggle buttons shall have a button type of interface and press in/out animation and colors (Implemented: No)</w:t>
+        <w:t xml:space="preserve"> of the screen (Implemented: Yes)</w:t>
+      </w:r>
+    </w:p>
+    <w:p>
+      <w:pPr>
+        <w:rPr>
+          <w:lang w:val="en-US"/>
+        </w:rPr>
+      </w:pPr>
+      <w:r>
+        <w:rPr>
+          <w:lang w:val="en-US"/>
+        </w:rPr>
+        <w:t>Both press and toggle buttons shall have a button type of interface and press in/out animation and colors (Implemented: Yes)</w:t>
       </w:r>
     </w:p>
     <w:p>

</xml_diff>

<commit_message>
Docs: set project version back to 0.2.1
</commit_message>
<xml_diff>
--- a/EyalEspressoRequirements and Design.docx
+++ b/EyalEspressoRequirements and Design.docx
@@ -2,14 +2,14 @@
 <file path=docProps\app.xml><?xml version="1.0" encoding="utf-8"?>
 <Properties xmlns="http://schemas.openxmlformats.org/officeDocument/2006/extended-properties" xmlns:vt="http://schemas.openxmlformats.org/officeDocument/2006/docPropsVTypes">
   <Template>Normal.dotm</Template>
-  <TotalTime>127</TotalTime>
-  <Pages>1</Pages>
-  <Words>971</Words>
-  <Characters>5722</Characters>
+  <TotalTime>134</TotalTime>
+  <Pages>6</Pages>
+  <Words>1044</Words>
+  <Characters>6142</Characters>
   <Application>Microsoft Office Word</Application>
   <DocSecurity>0</DocSecurity>
-  <Lines>130</Lines>
-  <Paragraphs>77</Paragraphs>
+  <Lines>139</Lines>
+  <Paragraphs>83</Paragraphs>
   <ScaleCrop>false</ScaleCrop>
   <HeadingPairs>
     <vt:vector size="2" baseType="variant">
@@ -28,7 +28,7 @@
   </TitlesOfParts>
   <Company/>
   <LinksUpToDate>false</LinksUpToDate>
-  <CharactersWithSpaces>6616</CharactersWithSpaces>
+  <CharactersWithSpaces>7103</CharactersWithSpaces>
   <SharedDoc>false</SharedDoc>
   <HyperlinksChanged>false</HyperlinksChanged>
   <AppVersion>16.0000</AppVersion>
@@ -38,9 +38,9 @@
 <file path=docProps\core.xml><?xml version="1.0" encoding="utf-8"?>
 <cp:coreProperties xmlns:cp="http://schemas.openxmlformats.org/package/2006/metadata/core-properties" xmlns:dc="http://purl.org/dc/elements/1.1/" xmlns:dcterms="http://purl.org/dc/terms/" xmlns:dcmitype="http://purl.org/dc/dcmitype/" xmlns:xsi="http://www.w3.org/2001/XMLSchema-instance">
   <cp:lastModifiedBy>Eyal Glotman @CRnR</cp:lastModifiedBy>
-  <cp:revision>16</cp:revision>
+  <cp:revision>21</cp:revision>
   <dcterms:created xsi:type="dcterms:W3CDTF">2026-03-07T14:11:00Z</dcterms:created>
-  <dcterms:modified xsi:type="dcterms:W3CDTF">2026-03-07T17:55:00Z</dcterms:modified>
+  <dcterms:modified xsi:type="dcterms:W3CDTF">2026-03-07T18:50:00Z</dcterms:modified>
 </cp:coreProperties>
 </file>
 
@@ -77,21 +77,7 @@
         <w:rPr>
           <w:lang w:val="en-US"/>
         </w:rPr>
-        <w:t xml:space="preserve">Reviewed </w:t>
-      </w:r>
-      <w:proofErr w:type="gramStart"/>
-      <w:r>
-        <w:rPr>
-          <w:lang w:val="en-US"/>
-        </w:rPr>
-        <w:t>on:</w:t>
-      </w:r>
-      <w:proofErr w:type="gramEnd"/>
-      <w:r>
-        <w:rPr>
-          <w:lang w:val="en-US"/>
-        </w:rPr>
-        <w:t xml:space="preserve"> 07-Mar-26 20:42:55</w:t>
+        <w:t>Reviewed on: 08-Mar-26 08:51:43</w:t>
       </w:r>
     </w:p>
     <w:p>
@@ -256,35 +242,85 @@
         <w:rPr>
           <w:lang w:val="en-US"/>
         </w:rPr>
-        <w:t>During initialization, the client shall test for internal ESP32 components status, as well as request from the Server (</w:t>
-      </w:r>
-      <w:proofErr w:type="spellStart"/>
-      <w:r>
-        <w:rPr>
-          <w:lang w:val="en-US"/>
-        </w:rPr>
-        <w:t>i.e</w:t>
-      </w:r>
-      <w:proofErr w:type="spellEnd"/>
+        <w:t>During initialization, the client shall test for internal ESP32 components status, as well as request from the Server (i.e Gaggia Controller) to initialize the coffee machine and respond with its status.</w:t>
+      </w:r>
       <w:r>
         <w:rPr>
           <w:lang w:val="en-US"/>
         </w:rPr>
         <w:t xml:space="preserve"> </w:t>
       </w:r>
-      <w:proofErr w:type="spellStart"/>
-      <w:r>
-        <w:rPr>
-          <w:lang w:val="en-US"/>
-        </w:rPr>
-        <w:t>Gaggia</w:t>
-      </w:r>
-      <w:proofErr w:type="spellEnd"/>
-      <w:r>
-        <w:rPr>
-          <w:lang w:val="en-US"/>
-        </w:rPr>
-        <w:t xml:space="preserve"> Controller) to initialize the coffee machine and respond with its status.</w:t>
+      <w:r>
+        <w:rPr>
+          <w:lang w:val="en-US"/>
+        </w:rPr>
+        <w:t>(Implemented: Yes)</w:t>
+      </w:r>
+    </w:p>
+    <w:p>
+      <w:pPr>
+        <w:pStyle w:val="ListParagraph"/>
+        <w:numPr>
+          <w:ilvl w:val="0"/>
+          <w:numId w:val="1"/>
+        </w:numPr>
+        <w:ind w:left="1134" w:hanging="1134"/>
+      </w:pPr>
+      <w:r>
+        <w:rPr>
+          <w:lang w:val="en-US"/>
+        </w:rPr>
+        <w:t xml:space="preserve">While initializing, the splash screen shall have a text â€œInitializing Systemâ€¦â€ as well as changing texts that indicate what component is getting initialized. </w:t>
+      </w:r>
+      <w:r>
+        <w:rPr>
+          <w:lang w:val="en-US"/>
+        </w:rPr>
+        <w:t>(Implemented: Yes)</w:t>
+      </w:r>
+    </w:p>
+    <w:p>
+      <w:pPr>
+        <w:pStyle w:val="ListParagraph"/>
+        <w:numPr>
+          <w:ilvl w:val="0"/>
+          <w:numId w:val="1"/>
+        </w:numPr>
+        <w:ind w:left="1134" w:hanging="1134"/>
+      </w:pPr>
+      <w:r>
+        <w:rPr>
+          <w:lang w:val="en-US"/>
+        </w:rPr>
+        <w:t xml:space="preserve">In case a component has not succeeded to initialize, the text shall be highlighted red and a Fail indication on screen. </w:t>
+      </w:r>
+      <w:r>
+        <w:rPr>
+          <w:lang w:val="en-US"/>
+        </w:rPr>
+        <w:t xml:space="preserve"> </w:t>
+      </w:r>
+      <w:r>
+        <w:rPr>
+          <w:lang w:val="en-US"/>
+        </w:rPr>
+        <w:t>(Implemented: No)</w:t>
+      </w:r>
+    </w:p>
+    <w:p>
+      <w:pPr>
+        <w:pStyle w:val="ListParagraph"/>
+        <w:numPr>
+          <w:ilvl w:val="0"/>
+          <w:numId w:val="1"/>
+        </w:numPr>
+        <w:ind w:left="1134" w:hanging="1134"/>
+      </w:pPr>
+      <w:r>
+        <w:rPr>
+          <w:lang w:val="en-US"/>
+        </w:rPr>
+        <w:t xml:space="preserve">Upon failing initialization for a component, a button on the bottom named â€œConfirmâ€ appears and after pressed the screen will switch to the â€œErrorâ€ screen </w:t>
       </w:r>
     </w:p>
     <w:p>
@@ -466,6 +502,7 @@
         <w:ind w:left="1134" w:hanging="1134"/>
       </w:pPr>
       <w:r>
+        <w:lastRenderedPageBreak/>
         <w:t>The header shall continuously display operating mode, active profile, target temperature, shot timer, and synthetic pressure feedback. (Implemented: Yes)</w:t>
       </w:r>
     </w:p>
@@ -511,114 +548,114 @@
         <w:rPr>
           <w:lang w:val="en-US"/>
         </w:rPr>
+        <w:t>The system shall read and load constants from the constants DB during initialization (Implemented: No)</w:t>
+      </w:r>
+    </w:p>
+    <w:p>
+      <w:pPr>
+        <w:pStyle w:val="ListParagraph"/>
+        <w:numPr>
+          <w:ilvl w:val="0"/>
+          <w:numId w:val="1"/>
+        </w:numPr>
+        <w:ind w:left="1134" w:hanging="1134"/>
+      </w:pPr>
+      <w:r>
+        <w:rPr>
+          <w:lang w:val="en-US"/>
+        </w:rPr>
+        <w:t xml:space="preserve">The constants shall include the </w:t>
+      </w:r>
+      <w:r>
+        <w:rPr>
+          <w:lang w:val="en-US"/>
+        </w:rPr>
+        <w:t>profile names and the number of profiles</w:t>
+      </w:r>
+      <w:r>
+        <w:rPr>
+          <w:lang w:val="en-US"/>
+        </w:rPr>
+        <w:t>. The project shall include default profiles:</w:t>
+      </w:r>
+      <w:r>
+        <w:t xml:space="preserve"> Classic 9 Bar, Turbo Shot, and Light Roast.</w:t>
+      </w:r>
+      <w:r>
+        <w:rPr>
+          <w:lang w:val="en-US"/>
+        </w:rPr>
+        <w:t xml:space="preserve"> </w:t>
+      </w:r>
+    </w:p>
+    <w:p/>
+    <w:p>
+      <w:r>
+        <w:t>4. Non-Functional Requirements</w:t>
+      </w:r>
+    </w:p>
+    <w:p>
+      <w:r>
+        <w:t>Performance: Screen transitions and control updates shall feel immediate on the ESP32-S3 target. (Implemented: Yes)</w:t>
+      </w:r>
+    </w:p>
+    <w:p>
+      <w:r>
+        <w:t>Reliability: The display path shall remain visually stable without right-shift drift or animation flicker under the validated RGB configuration. (Implemented: Yes)</w:t>
+      </w:r>
+    </w:p>
+    <w:p>
+      <w:r>
+        <w:t>Safety: Brew and Steam shall not remain active together in software state. (Implemented: Yes)</w:t>
+      </w:r>
+    </w:p>
+    <w:p>
+      <w:r>
+        <w:t>Maintainability: Requirements, revision history, defects, and workflow rules shall be tracked in repository documents. (Implemented: Yes)</w:t>
+      </w:r>
+    </w:p>
+    <w:p/>
+    <w:p>
+      <w:r>
+        <w:t>5. UX and UI Design</w:t>
+      </w:r>
+    </w:p>
+    <w:p>
+      <w:r>
+        <w:t>Navigation Model: Top tab bar plus left/right swipe navigation across a tabview. (Implemented: Yes)</w:t>
+      </w:r>
+    </w:p>
+    <w:p>
+      <w:r>
+        <w:t>Screen List: Dashboard/Home, Brew, Profiles, Settings. (Implemented: Yes)</w:t>
+      </w:r>
+    </w:p>
+    <w:p>
+      <w:r>
+        <w:t>Visual Style: Dark theme with blue accent, muted text for secondary information, and card-based sections. (Implemented: Yes)</w:t>
+      </w:r>
+    </w:p>
+    <w:p>
+      <w:pPr>
+        <w:rPr>
+          <w:lang w:val="en-US"/>
+        </w:rPr>
+      </w:pPr>
+      <w:r>
+        <w:t>Interaction Notes: Use large touch targets, maintain clear selected-tab state, and keep active profile visually highlighted. (Implemented: Yes)</w:t>
+      </w:r>
+    </w:p>
+    <w:p>
+      <w:pPr>
+        <w:rPr>
+          <w:lang w:val="en-US"/>
+        </w:rPr>
+      </w:pPr>
+      <w:r>
+        <w:rPr>
+          <w:lang w:val="en-US"/>
+        </w:rPr>
         <w:lastRenderedPageBreak/>
-        <w:t>The system shall read and load constants from the constants DB during initialization (Implemented: No)</w:t>
-      </w:r>
-    </w:p>
-    <w:p>
-      <w:pPr>
-        <w:pStyle w:val="ListParagraph"/>
-        <w:numPr>
-          <w:ilvl w:val="0"/>
-          <w:numId w:val="1"/>
-        </w:numPr>
-        <w:ind w:left="1134" w:hanging="1134"/>
-      </w:pPr>
-      <w:r>
-        <w:rPr>
-          <w:lang w:val="en-US"/>
-        </w:rPr>
-        <w:t xml:space="preserve">The constants shall include the </w:t>
-      </w:r>
-      <w:r>
-        <w:rPr>
-          <w:lang w:val="en-US"/>
-        </w:rPr>
-        <w:t>profile names and the number of profiles</w:t>
-      </w:r>
-      <w:r>
-        <w:rPr>
-          <w:lang w:val="en-US"/>
-        </w:rPr>
-        <w:t>. The project shall include default profiles:</w:t>
-      </w:r>
-      <w:r>
-        <w:t xml:space="preserve"> Classic 9 Bar, Turbo Shot, and Light Roast.</w:t>
-      </w:r>
-      <w:r>
-        <w:rPr>
-          <w:lang w:val="en-US"/>
-        </w:rPr>
-        <w:t xml:space="preserve"> </w:t>
-      </w:r>
-    </w:p>
-    <w:p/>
-    <w:p>
-      <w:r>
-        <w:t>4. Non-Functional Requirements</w:t>
-      </w:r>
-    </w:p>
-    <w:p>
-      <w:r>
-        <w:t>Performance: Screen transitions and control updates shall feel immediate on the ESP32-S3 target. (Implemented: Yes)</w:t>
-      </w:r>
-    </w:p>
-    <w:p>
-      <w:r>
-        <w:t>Reliability: The display path shall remain visually stable without right-shift drift or animation flicker under the validated RGB configuration. (Implemented: Yes)</w:t>
-      </w:r>
-    </w:p>
-    <w:p>
-      <w:r>
-        <w:t>Safety: Brew and Steam shall not remain active together in software state. (Implemented: Yes)</w:t>
-      </w:r>
-    </w:p>
-    <w:p>
-      <w:r>
-        <w:t>Maintainability: Requirements, revision history, defects, and workflow rules shall be tracked in repository documents. (Implemented: Yes)</w:t>
-      </w:r>
-    </w:p>
-    <w:p/>
-    <w:p>
-      <w:r>
-        <w:t>5. UX and UI Design</w:t>
-      </w:r>
-    </w:p>
-    <w:p>
-      <w:r>
-        <w:t>Navigation Model: Top tab bar plus left/right swipe navigation across a tabview. (Implemented: Yes)</w:t>
-      </w:r>
-    </w:p>
-    <w:p>
-      <w:r>
-        <w:t>Screen List: Dashboard/Home, Brew, Profiles, Settings. (Implemented: Yes)</w:t>
-      </w:r>
-    </w:p>
-    <w:p>
-      <w:r>
-        <w:t>Visual Style: Dark theme with blue accent, muted text for secondary information, and card-based sections. (Implemented: Yes)</w:t>
-      </w:r>
-    </w:p>
-    <w:p>
-      <w:pPr>
-        <w:rPr>
-          <w:lang w:val="en-US"/>
-        </w:rPr>
-      </w:pPr>
-      <w:r>
-        <w:t>Interaction Notes: Use large touch targets, maintain clear selected-tab state, and keep active profile visually highlighted. (Implemented: Yes)</w:t>
-      </w:r>
-    </w:p>
-    <w:p>
-      <w:pPr>
-        <w:rPr>
-          <w:lang w:val="en-US"/>
-        </w:rPr>
-      </w:pPr>
-      <w:r>
-        <w:rPr>
-          <w:lang w:val="en-US"/>
-        </w:rPr>
         <w:t xml:space="preserve">All the text and interface shall be under one of the tabs except for a clock which will be always displayed on the bottom 10% of the screen. The tabs shall occupy the top 90% of the </w:t>
       </w:r>
       <w:r>
@@ -921,7 +958,6 @@
 <file path=word\settings.xml><?xml version="1.0" encoding="utf-8"?>
 <w:settings xmlns:mc="http://schemas.openxmlformats.org/markup-compatibility/2006" xmlns:o="urn:schemas-microsoft-com:office:office" xmlns:r="http://schemas.openxmlformats.org/officeDocument/2006/relationships" xmlns:m="http://schemas.openxmlformats.org/officeDocument/2006/math" xmlns:v="urn:schemas-microsoft-com:vml" xmlns:w10="urn:schemas-microsoft-com:office:word" xmlns:w="http://schemas.openxmlformats.org/wordprocessingml/2006/main" xmlns:w14="http://schemas.microsoft.com/office/word/2010/wordml" xmlns:w15="http://schemas.microsoft.com/office/word/2012/wordml" xmlns:w16cex="http://schemas.microsoft.com/office/word/2018/wordml/cex" xmlns:w16cid="http://schemas.microsoft.com/office/word/2016/wordml/cid" xmlns:w16="http://schemas.microsoft.com/office/word/2018/wordml" xmlns:w16du="http://schemas.microsoft.com/office/word/2023/wordml/word16du" xmlns:w16sdtdh="http://schemas.microsoft.com/office/word/2020/wordml/sdtdatahash" xmlns:w16sdtfl="http://schemas.microsoft.com/office/word/2024/wordml/sdtformatlock" xmlns:w16se="http://schemas.microsoft.com/office/word/2015/wordml/symex" xmlns:sl="http://schemas.openxmlformats.org/schemaLibrary/2006/main" mc:Ignorable="w14 w15 w16se w16cid w16 w16cex w16sdtdh w16sdtfl w16du">
   <w:zoom w:percent="100"/>
-  <w:proofState w:spelling="clean" w:grammar="clean"/>
   <w:defaultTabStop w:val="720"/>
   <w:characterSpacingControl w:val="doNotCompress"/>
   <w:compat>
@@ -936,6 +972,7 @@
     <w:rsid w:val="00172730"/>
     <w:rsid w:val="001F4DEF"/>
     <w:rsid w:val="00236E38"/>
+    <w:rsid w:val="00245A7D"/>
     <w:rsid w:val="00275A25"/>
     <w:rsid w:val="002B1BCE"/>
     <w:rsid w:val="00330EB9"/>
@@ -945,9 +982,14 @@
     <w:rsid w:val="0050552C"/>
     <w:rsid w:val="00587CD9"/>
     <w:rsid w:val="006B768B"/>
+    <w:rsid w:val="00736D09"/>
     <w:rsid w:val="008E7741"/>
     <w:rsid w:val="00964C1B"/>
+    <w:rsid w:val="00AB2F0E"/>
     <w:rsid w:val="00B45933"/>
+    <w:rsid w:val="00E34DE8"/>
+    <w:rsid w:val="00F142A5"/>
+    <w:rsid w:val="00F26601"/>
     <w:rsid w:val="00F746DB"/>
     <w:rsid w:val="00FF1329"/>
   </w:rsids>

</xml_diff>